<commit_message>
Copy last week's code as a starting point for Week 6
</commit_message>
<xml_diff>
--- a/Week5/Simple Chatbot.docx
+++ b/Week5/Simple Chatbot.docx
@@ -1547,7 +1547,7 @@
           </mc:Choice>
           <mc:Fallback>
             <w:pict>
-              <v:rect w14:anchorId="3182294E" id="Rectangle 1" o:spid="_x0000_s1026" style="position:absolute;margin-left:0;margin-top:-.05pt;width:482.55pt;height:248.55pt;z-index:251667456;visibility:visible;mso-wrap-style:square;mso-width-percent:0;mso-height-percent:0;mso-wrap-distance-left:9pt;mso-wrap-distance-top:0;mso-wrap-distance-right:9pt;mso-wrap-distance-bottom:0;mso-position-horizontal:absolute;mso-position-horizontal-relative:text;mso-position-vertical:absolute;mso-position-vertical-relative:text;mso-width-percent:0;mso-height-percent:0;mso-width-relative:margin;mso-height-relative:margin;v-text-anchor:middle" o:gfxdata="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" filled="f" strokecolor="#030e13 [484]" strokeweight="1pt">
+              <v:rect w14:anchorId="5FDA78F7" id="Rectangle 1" o:spid="_x0000_s1026" style="position:absolute;margin-left:0;margin-top:-.05pt;width:482.55pt;height:248.55pt;z-index:251667456;visibility:visible;mso-wrap-style:square;mso-width-percent:0;mso-height-percent:0;mso-wrap-distance-left:9pt;mso-wrap-distance-top:0;mso-wrap-distance-right:9pt;mso-wrap-distance-bottom:0;mso-position-horizontal:absolute;mso-position-horizontal-relative:text;mso-position-vertical:absolute;mso-position-vertical-relative:text;mso-width-percent:0;mso-height-percent:0;mso-width-relative:margin;mso-height-relative:margin;v-text-anchor:middle" o:gfxdata="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" filled="f" strokecolor="#030e13 [484]" strokeweight="1pt">
                 <v:stroke dashstyle="3 1"/>
               </v:rect>
             </w:pict>
@@ -1765,7 +1765,7 @@
           </mc:Choice>
           <mc:Fallback>
             <w:pict>
-              <v:rect w14:anchorId="5B58B0B7" id="Rectangle 1" o:spid="_x0000_s1026" style="position:absolute;margin-left:14.55pt;margin-top:105.95pt;width:482.55pt;height:248.55pt;z-index:251669504;visibility:visible;mso-wrap-style:square;mso-width-percent:0;mso-height-percent:0;mso-wrap-distance-left:9pt;mso-wrap-distance-top:0;mso-wrap-distance-right:9pt;mso-wrap-distance-bottom:0;mso-position-horizontal:absolute;mso-position-horizontal-relative:text;mso-position-vertical:absolute;mso-position-vertical-relative:text;mso-width-percent:0;mso-height-percent:0;mso-width-relative:margin;mso-height-relative:margin;v-text-anchor:middle" o:gfxdata="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" filled="f" strokecolor="#030e13 [484]" strokeweight="1pt">
+              <v:rect w14:anchorId="26CE67C9" id="Rectangle 1" o:spid="_x0000_s1026" style="position:absolute;margin-left:14.55pt;margin-top:105.95pt;width:482.55pt;height:248.55pt;z-index:251669504;visibility:visible;mso-wrap-style:square;mso-width-percent:0;mso-height-percent:0;mso-wrap-distance-left:9pt;mso-wrap-distance-top:0;mso-wrap-distance-right:9pt;mso-wrap-distance-bottom:0;mso-position-horizontal:absolute;mso-position-horizontal-relative:text;mso-position-vertical:absolute;mso-position-vertical-relative:text;mso-width-percent:0;mso-height-percent:0;mso-width-relative:margin;mso-height-relative:margin;v-text-anchor:middle" o:gfxdata="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" filled="f" strokecolor="#030e13 [484]" strokeweight="1pt">
                 <v:stroke dashstyle="3 1"/>
               </v:rect>
             </w:pict>
@@ -2589,7 +2589,6 @@
           <w:rFonts w:ascii="Times New Roman" w:hAnsi="Times New Roman" w:cs="Times New Roman"/>
           <w:sz w:val="22"/>
           <w:szCs w:val="22"/>
-          <w:u w:val="single"/>
         </w:rPr>
       </w:pPr>
       <w:r>
@@ -2700,6 +2699,74 @@
         </w:rPr>
         <w:t xml:space="preserve"> and I accept responsibility for all submitted work. </w:t>
       </w:r>
+    </w:p>
+    <w:p>
+      <w:pPr>
+        <w:spacing w:line="480" w:lineRule="auto"/>
+        <w:rPr>
+          <w:rFonts w:ascii="Times New Roman" w:hAnsi="Times New Roman" w:cs="Times New Roman"/>
+          <w:sz w:val="22"/>
+          <w:szCs w:val="22"/>
+        </w:rPr>
+      </w:pPr>
+      <w:r>
+        <w:rPr>
+          <w:rFonts w:ascii="Times New Roman" w:hAnsi="Times New Roman" w:cs="Times New Roman"/>
+          <w:sz w:val="22"/>
+          <w:szCs w:val="22"/>
+        </w:rPr>
+        <w:t xml:space="preserve">Project </w:t>
+      </w:r>
+      <w:proofErr w:type="spellStart"/>
+      <w:r>
+        <w:rPr>
+          <w:rFonts w:ascii="Times New Roman" w:hAnsi="Times New Roman" w:cs="Times New Roman"/>
+          <w:sz w:val="22"/>
+          <w:szCs w:val="22"/>
+        </w:rPr>
+        <w:t>Github</w:t>
+      </w:r>
+      <w:proofErr w:type="spellEnd"/>
+      <w:r>
+        <w:rPr>
+          <w:rFonts w:ascii="Times New Roman" w:hAnsi="Times New Roman" w:cs="Times New Roman"/>
+          <w:sz w:val="22"/>
+          <w:szCs w:val="22"/>
+        </w:rPr>
+        <w:t xml:space="preserve"> repo: </w:t>
+      </w:r>
+      <w:hyperlink r:id="rId21" w:history="1">
+        <w:r>
+          <w:rPr>
+            <w:rStyle w:val="Hyperlink"/>
+            <w:rFonts w:ascii="Times New Roman" w:hAnsi="Times New Roman" w:cs="Times New Roman"/>
+            <w:sz w:val="22"/>
+            <w:szCs w:val="22"/>
+            <w:u w:val="none"/>
+          </w:rPr>
+          <w:t>ht</w:t>
+        </w:r>
+        <w:r>
+          <w:rPr>
+            <w:rStyle w:val="Hyperlink"/>
+            <w:rFonts w:ascii="Times New Roman" w:hAnsi="Times New Roman" w:cs="Times New Roman"/>
+            <w:sz w:val="22"/>
+            <w:szCs w:val="22"/>
+            <w:u w:val="none"/>
+          </w:rPr>
+          <w:t>t</w:t>
+        </w:r>
+        <w:r>
+          <w:rPr>
+            <w:rStyle w:val="Hyperlink"/>
+            <w:rFonts w:ascii="Times New Roman" w:hAnsi="Times New Roman" w:cs="Times New Roman"/>
+            <w:sz w:val="22"/>
+            <w:szCs w:val="22"/>
+            <w:u w:val="none"/>
+          </w:rPr>
+          <w:t>ps://github.com/manishfsb/AI4HCI/tree/main/Week5</w:t>
+        </w:r>
+      </w:hyperlink>
     </w:p>
     <w:p>
       <w:pPr>
@@ -2819,7 +2886,7 @@
         </w:rPr>
         <w:t xml:space="preserve">. </w:t>
       </w:r>
-      <w:hyperlink r:id="rId21" w:history="1">
+      <w:hyperlink r:id="rId22" w:history="1">
         <w:r>
           <w:rPr>
             <w:rStyle w:val="Hyperlink"/>
@@ -2919,7 +2986,7 @@
         </w:rPr>
         <w:t xml:space="preserve">. </w:t>
       </w:r>
-      <w:hyperlink r:id="rId22" w:history="1">
+      <w:hyperlink r:id="rId23" w:history="1">
         <w:r>
           <w:rPr>
             <w:rStyle w:val="Hyperlink"/>
@@ -4769,6 +4836,18 @@
       <w:shd w:val="clear" w:color="auto" w:fill="E1DFDD"/>
     </w:rPr>
   </w:style>
+  <w:style w:type="character" w:styleId="FollowedHyperlink">
+    <w:name w:val="FollowedHyperlink"/>
+    <w:basedOn w:val="DefaultParagraphFont"/>
+    <w:uiPriority w:val="99"/>
+    <w:semiHidden/>
+    <w:unhideWhenUsed/>
+    <w:rsid w:val="006238B6"/>
+    <w:rPr>
+      <w:color w:val="96607D" w:themeColor="followedHyperlink"/>
+      <w:u w:val="single"/>
+    </w:rPr>
+  </w:style>
 </w:styles>
 </file>
 

</xml_diff>